<commit_message>
Deployed 78da759 with MkDocs version: 1.6.1
</commit_message>
<xml_diff>
--- a/resources/A1_BCC_INTERNAL_Air_Source_Heat_Pump_Guidance_for_officers_and_installers.docx
+++ b/resources/A1_BCC_INTERNAL_Air_Source_Heat_Pump_Guidance_for_officers_and_installers.docx
@@ -277,7 +277,7 @@
                   </wp:anchor>
                 </w:drawing>
               </mc:Choice>
-              <mc:Fallback xmlns="">
+              <mc:Fallback>
                 <w:pict>
                   <v:shapetype w14:anchorId="5E7BC9A2" id="_x0000_t202" coordsize="21600,21600" o:spt="202" path="m,l,21600r21600,l21600,xe">
                     <v:stroke joinstyle="miter"/>
@@ -601,7 +601,7 @@
                   </wp:anchor>
                 </w:drawing>
               </mc:Choice>
-              <mc:Fallback xmlns="">
+              <mc:Fallback>
                 <w:pict>
                   <v:rect w14:anchorId="047E0307" id="Rectangle 132" o:spid="_x0000_s1027" style="position:absolute;margin-left:-4.4pt;margin-top:0;width:46.8pt;height:77.75pt;z-index:251658240;visibility:visible;mso-wrap-style:square;mso-width-percent:76;mso-height-percent:98;mso-top-percent:23;mso-wrap-distance-left:9pt;mso-wrap-distance-top:0;mso-wrap-distance-right:9pt;mso-wrap-distance-bottom:0;mso-position-horizontal:right;mso-position-horizontal-relative:margin;mso-position-vertical-relative:page;mso-width-percent:76;mso-height-percent:98;mso-top-percent:23;mso-width-relative:page;mso-height-relative:page;v-text-anchor:bottom" o:gfxdata="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" fillcolor="#4472c4 [3204]" stroked="f" strokeweight="1pt">
                     <o:lock v:ext="edit" aspectratio="t"/>
@@ -5095,12 +5095,6 @@
                 <w:rFonts w:asciiTheme="majorHAnsi" w:hAnsiTheme="majorHAnsi" w:cstheme="majorHAnsi"/>
               </w:rPr>
             </w:pPr>
-            <w:r>
-              <w:rPr>
-                <w:rFonts w:asciiTheme="majorHAnsi" w:hAnsiTheme="majorHAnsi" w:cstheme="majorHAnsi"/>
-              </w:rPr>
-              <w:t>Vaillant is preferred manufacturer, Daikin is secondary choice</w:t>
-            </w:r>
           </w:p>
         </w:tc>
         <w:tc>
@@ -8842,7 +8836,21 @@
         <w:rPr>
           <w:rFonts w:cstheme="minorHAnsi"/>
         </w:rPr>
-        <w:t xml:space="preserve">Due to the complexities in explaining concepts such as weather compensation it should be considered that controllers such as the </w:t>
+        <w:t xml:space="preserve">Due to the complexities in explaining concepts such as weather </w:t>
+      </w:r>
+      <w:proofErr w:type="gramStart"/>
+      <w:r>
+        <w:rPr>
+          <w:rFonts w:cstheme="minorHAnsi"/>
+        </w:rPr>
+        <w:t>compensation</w:t>
+      </w:r>
+      <w:proofErr w:type="gramEnd"/>
+      <w:r>
+        <w:rPr>
+          <w:rFonts w:cstheme="minorHAnsi"/>
+        </w:rPr>
+        <w:t xml:space="preserve"> it should be considered that controllers such as the </w:t>
       </w:r>
       <w:proofErr w:type="spellStart"/>
       <w:r>
@@ -9141,7 +9149,7 @@
         </w:rPr>
         <w:lastRenderedPageBreak/>
         <w:drawing>
-          <wp:inline distT="0" distB="0" distL="0" distR="0" wp14:anchorId="0E7EA7D2" wp14:editId="01D2FE26">
+          <wp:inline distT="0" distB="0" distL="0" distR="0" wp14:anchorId="0E7EA7D2" wp14:editId="0A1C5A8C">
             <wp:extent cx="4141601" cy="2928395"/>
             <wp:effectExtent l="0" t="0" r="0" b="5715"/>
             <wp:docPr id="5" name="Picture 5" descr="Diagram&#10;&#10;Description automatically generated"/>
@@ -12940,25 +12948,16 @@
 </file>
 
 <file path=customXml/item2.xml><?xml version="1.0" encoding="utf-8"?>
-<b:Sources xmlns:b="http://schemas.openxmlformats.org/officeDocument/2006/bibliography" xmlns="http://schemas.openxmlformats.org/officeDocument/2006/bibliography" SelectedStyle="\APASixthEditionOfficeOnline.xsl" StyleName="APA" Version="6"/>
-</file>
-
-<file path=customXml/item3.xml><?xml version="1.0" encoding="utf-8"?>
 <p:properties xmlns:p="http://schemas.microsoft.com/office/2006/metadata/properties" xmlns:xsi="http://www.w3.org/2001/XMLSchema-instance" xmlns:pc="http://schemas.microsoft.com/office/infopath/2007/PartnerControls">
   <documentManagement/>
 </p:properties>
 </file>
 
-<file path=customXml/item4.xml><?xml version="1.0" encoding="utf-8"?>
-<?mso-contentType ?>
-<FormTemplates xmlns="http://schemas.microsoft.com/sharepoint/v3/contenttype/forms">
-  <Display>DocumentLibraryForm</Display>
-  <Edit>DocumentLibraryForm</Edit>
-  <New>DocumentLibraryForm</New>
-</FormTemplates>
+<file path=customXml/item3.xml><?xml version="1.0" encoding="utf-8"?>
+<b:Sources xmlns:b="http://schemas.openxmlformats.org/officeDocument/2006/bibliography" xmlns="http://schemas.openxmlformats.org/officeDocument/2006/bibliography" SelectedStyle="\APASixthEditionOfficeOnline.xsl" StyleName="APA" Version="6"/>
 </file>
 
-<file path=customXml/item5.xml><?xml version="1.0" encoding="utf-8"?>
+<file path=customXml/item4.xml><?xml version="1.0" encoding="utf-8"?>
 <ct:contentTypeSchema xmlns:ct="http://schemas.microsoft.com/office/2006/metadata/contentType" xmlns:ma="http://schemas.microsoft.com/office/2006/metadata/properties/metaAttributes" ct:_="" ma:_="" ma:contentTypeName="Document" ma:contentTypeID="0x0101006B3C5AFA9F9D8E4BAC529AF6FBF213B9" ma:contentTypeVersion="8" ma:contentTypeDescription="Create a new document." ma:contentTypeScope="" ma:versionID="97c2688a651ac65a7a4f9d41c6bc8045">
   <xsd:schema xmlns:xsd="http://www.w3.org/2001/XMLSchema" xmlns:xs="http://www.w3.org/2001/XMLSchema" xmlns:p="http://schemas.microsoft.com/office/2006/metadata/properties" xmlns:ns2="5a18e9fb-fe8a-4794-ab96-bf9465308028" targetNamespace="http://schemas.microsoft.com/office/2006/metadata/properties" ma:root="true" ma:fieldsID="4aa7969c5cd0df7ad10853a61f7377cb" ns2:_="">
     <xsd:import namespace="5a18e9fb-fe8a-4794-ab96-bf9465308028"/>
@@ -13126,6 +13125,15 @@
 </ct:contentTypeSchema>
 </file>
 
+<file path=customXml/item5.xml><?xml version="1.0" encoding="utf-8"?>
+<?mso-contentType ?>
+<FormTemplates xmlns="http://schemas.microsoft.com/sharepoint/v3/contenttype/forms">
+  <Display>DocumentLibraryForm</Display>
+  <Edit>DocumentLibraryForm</Edit>
+  <New>DocumentLibraryForm</New>
+</FormTemplates>
+</file>
+
 <file path=customXml/itemProps1.xml><?xml version="1.0" encoding="utf-8"?>
 <ds:datastoreItem xmlns:ds="http://schemas.openxmlformats.org/officeDocument/2006/customXml" ds:itemID="{55AF091B-3C7A-41E3-B477-F2FDAA23CFDA}">
   <ds:schemaRefs>
@@ -13135,14 +13143,6 @@
 </file>
 
 <file path=customXml/itemProps2.xml><?xml version="1.0" encoding="utf-8"?>
-<ds:datastoreItem xmlns:ds="http://schemas.openxmlformats.org/officeDocument/2006/customXml" ds:itemID="{86668A04-9C79-43F1-BB25-F80D54DF1AE8}">
-  <ds:schemaRefs>
-    <ds:schemaRef ds:uri="http://schemas.openxmlformats.org/officeDocument/2006/bibliography"/>
-  </ds:schemaRefs>
-</ds:datastoreItem>
-</file>
-
-<file path=customXml/itemProps3.xml><?xml version="1.0" encoding="utf-8"?>
 <ds:datastoreItem xmlns:ds="http://schemas.openxmlformats.org/officeDocument/2006/customXml" ds:itemID="{C3E47D78-8BF4-4C2E-A977-6F9454CD01B8}">
   <ds:schemaRefs>
     <ds:schemaRef ds:uri="http://schemas.microsoft.com/office/2006/metadata/properties"/>
@@ -13151,15 +13151,15 @@
 </ds:datastoreItem>
 </file>
 
-<file path=customXml/itemProps4.xml><?xml version="1.0" encoding="utf-8"?>
-<ds:datastoreItem xmlns:ds="http://schemas.openxmlformats.org/officeDocument/2006/customXml" ds:itemID="{AD6A476D-EAA4-4B0F-958B-EAF4B097660C}">
+<file path=customXml/itemProps3.xml><?xml version="1.0" encoding="utf-8"?>
+<ds:datastoreItem xmlns:ds="http://schemas.openxmlformats.org/officeDocument/2006/customXml" ds:itemID="{86668A04-9C79-43F1-BB25-F80D54DF1AE8}">
   <ds:schemaRefs>
-    <ds:schemaRef ds:uri="http://schemas.microsoft.com/sharepoint/v3/contenttype/forms"/>
+    <ds:schemaRef ds:uri="http://schemas.openxmlformats.org/officeDocument/2006/bibliography"/>
   </ds:schemaRefs>
 </ds:datastoreItem>
 </file>
 
-<file path=customXml/itemProps5.xml><?xml version="1.0" encoding="utf-8"?>
+<file path=customXml/itemProps4.xml><?xml version="1.0" encoding="utf-8"?>
 <ds:datastoreItem xmlns:ds="http://schemas.openxmlformats.org/officeDocument/2006/customXml" ds:itemID="{B85C9821-6D8F-42A9-B817-3E0F65286DCF}">
   <ds:schemaRefs>
     <ds:schemaRef ds:uri="http://schemas.microsoft.com/office/2006/metadata/contentType"/>
@@ -13175,4 +13175,12 @@
     <ds:schemaRef ds:uri="http://schemas.microsoft.com/internal/obd"/>
   </ds:schemaRefs>
 </ds:datastoreItem>
+</file>
+
+<file path=customXml/itemProps5.xml><?xml version="1.0" encoding="utf-8"?>
+<ds:datastoreItem xmlns:ds="http://schemas.openxmlformats.org/officeDocument/2006/customXml" ds:itemID="{AD6A476D-EAA4-4B0F-958B-EAF4B097660C}">
+  <ds:schemaRefs>
+    <ds:schemaRef ds:uri="http://schemas.microsoft.com/sharepoint/v3/contenttype/forms"/>
+  </ds:schemaRefs>
+</ds:datastoreItem>
 </file>
</xml_diff>